<commit_message>
docs: replace test chapter with project map; refresh flow PNGs
Chapter 21 used to dump curl smoke output and a manual test matrix.
Replaced with a real project-map chapter that walks through three
embedded flow diagrams:

  - arch-flow.png — full layered architecture (clients, WCF on :8733,
    BusinessLogic, ViewDB, ProjectAssignmentDB, BManaged.accdb)
  - wpf-flow.png  — every WPF page with role-gated navigation,
    DispatcherTimer cadences, and the ResetRequest dbl-click cross-link
  - web-flow.png  — every Razor page with sub-feature labels (modal,
    CSV, Auto-VAT, multi-assign, etc.) + i18n + Notifications badge

_make_flows.py was rewritten to reflect the current architecture (port
8733, 15 WPF pages, 18 web pages, multi-assign, ForgotPassword,
EmployeeProjects).

_md_to_docx_v6.py now embeds PNG images via add_picture, so the docx
is self-contained at 229 KB.

Co-Authored-By: Claude Opus 4.7 <noreply@anthropic.com>
</commit_message>
<xml_diff>
--- a/ספר_פרויקט_B_Managed_FINAL_v6b.docx
+++ b/ספר_פרויקט_B_Managed_FINAL_v6b.docx
@@ -714,7 +714,7 @@
           <w:rtl/>
           <w:cs/>
         </w:rPr>
-        <w:t>בדיקות (smoke tests + UIA)</w:t>
+        <w:t>מפת הפרויקט (Project Map) — תמונות זרימה</w:t>
       </w:r>
     </w:p>
     <w:p>
@@ -10237,21 +10237,7 @@
           <w:rtl/>
           <w:cs/>
         </w:rPr>
-        <w:t>21. בדיקות</w:t>
-      </w:r>
-    </w:p>
-    <w:p>
-      <w:pPr>
-        <w:pStyle w:val="Heading2"/>
-        <w:bidi/>
-        <w:jc w:val="right"/>
-      </w:pPr>
-      <w:r>
-        <w:rPr>
-          <w:rtl/>
-          <w:cs/>
-        </w:rPr>
-        <w:t>21.1 Smoke test צד-Web (curl + python)</w:t>
+        <w:t>21. מפת הפרויקט (Project Map)</w:t>
       </w:r>
     </w:p>
     <w:p>
@@ -10265,53 +10251,7 @@
           <w:rtl/>
           <w:cs/>
         </w:rPr>
-        <w:t>_smoke.py מבצעת login → walk all 8 Owner pages → verify content matches expected needles. תוצאה:</w:t>
-      </w:r>
-    </w:p>
-    <w:p>
-      <w:pPr>
-        <w:shd w:val="clear" w:color="auto" w:fill="F2F2EE"/>
-        <w:jc w:val="left"/>
-      </w:pPr>
-      <w:r>
-        <w:rPr>
-          <w:rFonts w:ascii="Consolas" w:hAnsi="Consolas"/>
-          <w:color w:val="0B0B0F"/>
-          <w:sz w:val="18"/>
-        </w:rPr>
-        <w:t>OK   login page reachable</w:t>
-        <w:br/>
-        <w:t>OK   antiforgery token present</w:t>
-        <w:br/>
-        <w:t>OK   /Owner/Home — matched 2/2 needles</w:t>
-        <w:br/>
-        <w:t>OK   /Owner/Customers — matched 1/1 needles</w:t>
-        <w:br/>
-        <w:t>OK   /Owner/Projects — matched 1/1 needles</w:t>
-        <w:br/>
-        <w:t>OK   /Owner/Invoices — matched 1/1 needles</w:t>
-        <w:br/>
-        <w:t>OK   /Owner/Expenses — matched 2/2 needles</w:t>
-        <w:br/>
-        <w:t>OK   /Owner/Reports — matched 2/2 needles</w:t>
-        <w:br/>
-        <w:t>OK   /Owner/Users — matched 1/1 needles</w:t>
-        <w:br/>
-        <w:t>OK   /Notifications — matched 1/1 needles</w:t>
-        <w:br/>
-        <w:t>OK   /Notifications?handler=Count returns int — got 0</w:t>
-        <w:br/>
-        <w:t>OK   Sparkline JSON has labels+data — len=6</w:t>
-        <w:br/>
-        <w:t>OK   Stats JSON has unpaid counter</w:t>
-        <w:br/>
-        <w:t>OK   /Owner/Customers?handler=Csv — header: Id,BusinessName,...</w:t>
-        <w:br/>
-        <w:t>OK   /Owner/Expenses?handler=Csv — header: Id,Date,Category,...</w:t>
-        <w:br/>
-        <w:t>OK   Assignees JSON — keys=['assigned', 'available']</w:t>
-        <w:br/>
-        <w:t>OK   ForgotPassword page</w:t>
+        <w:t>הפרק הזה מציג את שלוש תמונות הזרימה של המערכת. הן נוצרות אוטומטית מ-_make_flows.py (PIL בלבד) כדי שהן יישארו תקפות ככל שהארכיטקטורה משתנה.</w:t>
       </w:r>
     </w:p>
     <w:p>
@@ -10325,76 +10265,7 @@
           <w:rtl/>
           <w:cs/>
         </w:rPr>
-        <w:t>21.2 Smoke test צד-WCF (SOAP envelope)</w:t>
-      </w:r>
-    </w:p>
-    <w:p>
-      <w:pPr>
-        <w:shd w:val="clear" w:color="auto" w:fill="F2F2EE"/>
-        <w:jc w:val="left"/>
-      </w:pPr>
-      <w:r>
-        <w:rPr>
-          <w:rFonts w:ascii="Consolas" w:hAnsi="Consolas"/>
-          <w:color w:val="0B0B0F"/>
-          <w:sz w:val="18"/>
-        </w:rPr>
-        <w:t>curl -X POST http://localhost:8733/.../Service1/ \</w:t>
-        <w:br/>
-        <w:t xml:space="preserve">  -H 'Content-Type: text/xml' \</w:t>
-        <w:br/>
-        <w:t xml:space="preserve">  -H 'SOAPAction: "http://tempuri.org/IService1/CheckUserExist"' \</w:t>
-        <w:br/>
-        <w:t xml:space="preserve">  --data @soap_request.xml</w:t>
-        <w:br/>
-        <w:br/>
-        <w:t># Response:</w:t>
-        <w:br/>
-        <w:t># &lt;s:Envelope ...&gt;&lt;s:Body&gt;</w:t>
-        <w:br/>
-        <w:t>#   &lt;CheckUserExistResponse xmlns="http://tempuri.org/"&gt;</w:t>
-        <w:br/>
-        <w:t>#     &lt;CheckUserExistResult&gt;true&lt;/CheckUserExistResult&gt;</w:t>
-        <w:br/>
-        <w:t>#   &lt;/CheckUserExistResponse&gt;</w:t>
-        <w:br/>
-        <w:t># &lt;/s:Body&gt;&lt;/s:Envelope&gt;</w:t>
-      </w:r>
-    </w:p>
-    <w:p>
-      <w:pPr>
-        <w:pStyle w:val="Heading2"/>
-        <w:bidi/>
-        <w:jc w:val="right"/>
-      </w:pPr>
-      <w:r>
-        <w:rPr>
-          <w:rtl/>
-          <w:cs/>
-        </w:rPr>
-        <w:t>21.3 בדיקה צד-WPF (UI Automation)</w:t>
-      </w:r>
-    </w:p>
-    <w:p>
-      <w:pPr>
-        <w:shd w:val="clear" w:color="auto" w:fill="F2F2EE"/>
-        <w:jc w:val="left"/>
-      </w:pPr>
-      <w:r>
-        <w:rPr>
-          <w:rFonts w:ascii="Consolas" w:hAnsi="Consolas"/>
-          <w:color w:val="0B0B0F"/>
-          <w:sz w:val="18"/>
-        </w:rPr>
-        <w:t>Add-Type -AssemblyName UIAutomationClient</w:t>
-        <w:br/>
-        <w:t>$root = [Windows.Automation.AutomationElement]::RootElement</w:t>
-        <w:br/>
-        <w:t>$cond = New-Object Windows.Automation.PropertyCondition(...)</w:t>
-        <w:br/>
-        <w:t>$win  = $root.FindFirst([Windows.Automation.TreeScope]::Children, $cond)</w:t>
-        <w:br/>
-        <w:t># מעבר על העץ ובדיקה שכל הקונטרולים שצריכים נמצאים</w:t>
+        <w:t>21.1 ארכיטקטורת המערכת — `arch-flow.png`</w:t>
       </w:r>
     </w:p>
     <w:p>
@@ -10408,12 +10279,12 @@
           <w:rtl/>
           <w:cs/>
         </w:rPr>
-        <w:t>עץ ה-UI מאשר שכל הדפים מציגים את הקונטרולים הצפויים: LogIn (USERNAME, PASSWORD, Sign in button), OwnerHome (4 stat cards, 6 quick actions, notification bell with badge), וכו׳.</w:t>
+        <w:t>תמונה זו מציגה את ערמת השכבות מקצה לקצה:</w:t>
       </w:r>
     </w:p>
     <w:p>
       <w:pPr>
-        <w:pStyle w:val="Heading2"/>
+        <w:pStyle w:val="ListBullet"/>
         <w:bidi/>
         <w:jc w:val="right"/>
       </w:pPr>
@@ -10422,824 +10293,392 @@
           <w:rtl/>
           <w:cs/>
         </w:rPr>
-        <w:t>21.4 בדיקות שלביות (manual)</w:t>
+        <w:t>שני לקוחות בקצה העליון: BManagedClient (WPF) עם 15 דפים, פרוקסי svcutil-generated BMsrv, ו-DispatcherTimer לפולינג. BManagedWeb (Razor) עם 18 דפים, פרוקסי hand-written bsrv, ו-setInterval לפולינג.</w:t>
       </w:r>
     </w:p>
-    <w:tbl>
-      <w:tblPr>
-        <w:tblStyle w:val="LightGrid-Accent1"/>
-        <w:tblW w:type="auto" w:w="0"/>
+    <w:p>
+      <w:pPr>
+        <w:pStyle w:val="ListBullet"/>
+        <w:bidi/>
         <w:jc w:val="right"/>
-        <w:tblLook w:firstColumn="1" w:firstRow="1" w:lastColumn="0" w:lastRow="0" w:noHBand="0" w:noVBand="1" w:val="04A0"/>
-        <w:bidiVisual/>
-      </w:tblPr>
-      <w:tblGrid>
-        <w:gridCol w:w="4802"/>
-        <w:gridCol w:w="4802"/>
-      </w:tblGrid>
-      <w:tr>
-        <w:tc>
-          <w:tcPr>
-            <w:tcW w:type="dxa" w:w="4802"/>
-          </w:tcPr>
-          <w:p>
-            <w:pPr>
-              <w:bidi/>
-              <w:jc w:val="right"/>
-            </w:pPr>
-            <w:r>
-              <w:rPr>
-                <w:rtl/>
-                <w:cs/>
-              </w:rPr>
-            </w:r>
-            <w:r>
-              <w:rPr>
-                <w:b/>
-                <w:rtl/>
-                <w:cs/>
-              </w:rPr>
-              <w:t>תרחיש</w:t>
-            </w:r>
-          </w:p>
-        </w:tc>
-        <w:tc>
-          <w:tcPr>
-            <w:tcW w:type="dxa" w:w="4802"/>
-          </w:tcPr>
-          <w:p>
-            <w:pPr>
-              <w:bidi/>
-              <w:jc w:val="right"/>
-            </w:pPr>
-            <w:r>
-              <w:rPr>
-                <w:rtl/>
-                <w:cs/>
-              </w:rPr>
-            </w:r>
-            <w:r>
-              <w:rPr>
-                <w:b/>
-                <w:rtl/>
-                <w:cs/>
-              </w:rPr>
-              <w:t>תוצאה</w:t>
-            </w:r>
-          </w:p>
-        </w:tc>
-      </w:tr>
-      <w:tr>
-        <w:tc>
-          <w:tcPr>
-            <w:tcW w:type="dxa" w:w="4802"/>
-          </w:tcPr>
-          <w:p>
-            <w:pPr>
-              <w:bidi/>
-              <w:jc w:val="right"/>
-            </w:pPr>
-            <w:r>
-              <w:rPr>
-                <w:rtl/>
-                <w:cs/>
-              </w:rPr>
-            </w:r>
-            <w:r>
-              <w:rPr>
-                <w:rtl/>
-                <w:cs/>
-              </w:rPr>
-              <w:t>כניסה כ-admin/admin1234</w:t>
-            </w:r>
-          </w:p>
-        </w:tc>
-        <w:tc>
-          <w:tcPr>
-            <w:tcW w:type="dxa" w:w="4802"/>
-          </w:tcPr>
-          <w:p>
-            <w:pPr>
-              <w:bidi/>
-              <w:jc w:val="right"/>
-            </w:pPr>
-            <w:r>
-              <w:rPr>
-                <w:rtl/>
-                <w:cs/>
-              </w:rPr>
-            </w:r>
-            <w:r>
-              <w:rPr>
-                <w:rtl/>
-                <w:cs/>
-              </w:rPr>
-              <w:t>OK — מועבר ל-OwnerHome</w:t>
-            </w:r>
-          </w:p>
-        </w:tc>
-      </w:tr>
-      <w:tr>
-        <w:tc>
-          <w:tcPr>
-            <w:tcW w:type="dxa" w:w="4802"/>
-          </w:tcPr>
-          <w:p>
-            <w:pPr>
-              <w:bidi/>
-              <w:jc w:val="right"/>
-            </w:pPr>
-            <w:r>
-              <w:rPr>
-                <w:rtl/>
-                <w:cs/>
-              </w:rPr>
-            </w:r>
-            <w:r>
-              <w:rPr>
-                <w:rtl/>
-                <w:cs/>
-              </w:rPr>
-              <w:t>כניסה כ-dana/admin1234</w:t>
-            </w:r>
-          </w:p>
-        </w:tc>
-        <w:tc>
-          <w:tcPr>
-            <w:tcW w:type="dxa" w:w="4802"/>
-          </w:tcPr>
-          <w:p>
-            <w:pPr>
-              <w:bidi/>
-              <w:jc w:val="right"/>
-            </w:pPr>
-            <w:r>
-              <w:rPr>
-                <w:rtl/>
-                <w:cs/>
-              </w:rPr>
-            </w:r>
-            <w:r>
-              <w:rPr>
-                <w:rtl/>
-                <w:cs/>
-              </w:rPr>
-              <w:t>OK — מועבר ל-EmployeeHome</w:t>
-            </w:r>
-          </w:p>
-        </w:tc>
-      </w:tr>
-      <w:tr>
-        <w:tc>
-          <w:tcPr>
-            <w:tcW w:type="dxa" w:w="4802"/>
-          </w:tcPr>
-          <w:p>
-            <w:pPr>
-              <w:bidi/>
-              <w:jc w:val="right"/>
-            </w:pPr>
-            <w:r>
-              <w:rPr>
-                <w:rtl/>
-                <w:cs/>
-              </w:rPr>
-            </w:r>
-            <w:r>
-              <w:rPr>
-                <w:rtl/>
-                <w:cs/>
-              </w:rPr>
-              <w:t>כניסה כ-acme/admin1234 (אחרי אישור)</w:t>
-            </w:r>
-          </w:p>
-        </w:tc>
-        <w:tc>
-          <w:tcPr>
-            <w:tcW w:type="dxa" w:w="4802"/>
-          </w:tcPr>
-          <w:p>
-            <w:pPr>
-              <w:bidi/>
-              <w:jc w:val="right"/>
-            </w:pPr>
-            <w:r>
-              <w:rPr>
-                <w:rtl/>
-                <w:cs/>
-              </w:rPr>
-            </w:r>
-            <w:r>
-              <w:rPr>
-                <w:rtl/>
-                <w:cs/>
-              </w:rPr>
-              <w:t>OK — מועבר ל-Client Portal</w:t>
-            </w:r>
-          </w:p>
-        </w:tc>
-      </w:tr>
-      <w:tr>
-        <w:tc>
-          <w:tcPr>
-            <w:tcW w:type="dxa" w:w="4802"/>
-          </w:tcPr>
-          <w:p>
-            <w:pPr>
-              <w:bidi/>
-              <w:jc w:val="right"/>
-            </w:pPr>
-            <w:r>
-              <w:rPr>
-                <w:rtl/>
-                <w:cs/>
-              </w:rPr>
-            </w:r>
-            <w:r>
-              <w:rPr>
-                <w:rtl/>
-                <w:cs/>
-              </w:rPr>
-              <w:t>כניסה עם סיסמה שגויה</w:t>
-            </w:r>
-          </w:p>
-        </w:tc>
-        <w:tc>
-          <w:tcPr>
-            <w:tcW w:type="dxa" w:w="4802"/>
-          </w:tcPr>
-          <w:p>
-            <w:pPr>
-              <w:bidi/>
-              <w:jc w:val="right"/>
-            </w:pPr>
-            <w:r>
-              <w:rPr>
-                <w:rtl/>
-                <w:cs/>
-              </w:rPr>
-            </w:r>
-            <w:r>
-              <w:rPr>
-                <w:rtl/>
-                <w:cs/>
-              </w:rPr>
-              <w:t>OK — שגיאה מוצגת</w:t>
-            </w:r>
-          </w:p>
-        </w:tc>
-      </w:tr>
-      <w:tr>
-        <w:tc>
-          <w:tcPr>
-            <w:tcW w:type="dxa" w:w="4802"/>
-          </w:tcPr>
-          <w:p>
-            <w:pPr>
-              <w:bidi/>
-              <w:jc w:val="right"/>
-            </w:pPr>
-            <w:r>
-              <w:rPr>
-                <w:rtl/>
-                <w:cs/>
-              </w:rPr>
-            </w:r>
-            <w:r>
-              <w:rPr>
-                <w:rtl/>
-                <w:cs/>
-              </w:rPr>
-              <w:t>הוספת לקוח חדש</w:t>
-            </w:r>
-          </w:p>
-        </w:tc>
-        <w:tc>
-          <w:tcPr>
-            <w:tcW w:type="dxa" w:w="4802"/>
-          </w:tcPr>
-          <w:p>
-            <w:pPr>
-              <w:bidi/>
-              <w:jc w:val="right"/>
-            </w:pPr>
-            <w:r>
-              <w:rPr>
-                <w:rtl/>
-                <w:cs/>
-              </w:rPr>
-            </w:r>
-            <w:r>
-              <w:rPr>
-                <w:rtl/>
-                <w:cs/>
-              </w:rPr>
-              <w:t>OK — מופיע ברשימה</w:t>
-            </w:r>
-          </w:p>
-        </w:tc>
-      </w:tr>
-      <w:tr>
-        <w:tc>
-          <w:tcPr>
-            <w:tcW w:type="dxa" w:w="4802"/>
-          </w:tcPr>
-          <w:p>
-            <w:pPr>
-              <w:bidi/>
-              <w:jc w:val="right"/>
-            </w:pPr>
-            <w:r>
-              <w:rPr>
-                <w:rtl/>
-                <w:cs/>
-              </w:rPr>
-            </w:r>
-            <w:r>
-              <w:rPr>
-                <w:rtl/>
-                <w:cs/>
-              </w:rPr>
-              <w:t>יצירת פרויקט חדש</w:t>
-            </w:r>
-          </w:p>
-        </w:tc>
-        <w:tc>
-          <w:tcPr>
-            <w:tcW w:type="dxa" w:w="4802"/>
-          </w:tcPr>
-          <w:p>
-            <w:pPr>
-              <w:bidi/>
-              <w:jc w:val="right"/>
-            </w:pPr>
-            <w:r>
-              <w:rPr>
-                <w:rtl/>
-                <w:cs/>
-              </w:rPr>
-            </w:r>
-            <w:r>
-              <w:rPr>
-                <w:rtl/>
-                <w:cs/>
-              </w:rPr>
-              <w:t>OK — מופיע ב-Projects</w:t>
-            </w:r>
-          </w:p>
-        </w:tc>
-      </w:tr>
-      <w:tr>
-        <w:tc>
-          <w:tcPr>
-            <w:tcW w:type="dxa" w:w="4802"/>
-          </w:tcPr>
-          <w:p>
-            <w:pPr>
-              <w:bidi/>
-              <w:jc w:val="right"/>
-            </w:pPr>
-            <w:r>
-              <w:rPr>
-                <w:rtl/>
-                <w:cs/>
-              </w:rPr>
-            </w:r>
-            <w:r>
-              <w:rPr>
-                <w:rtl/>
-                <w:cs/>
-              </w:rPr>
-              <w:t>הקצאת 3 עובדים לפרויקט</w:t>
-            </w:r>
-          </w:p>
-        </w:tc>
-        <w:tc>
-          <w:tcPr>
-            <w:tcW w:type="dxa" w:w="4802"/>
-          </w:tcPr>
-          <w:p>
-            <w:pPr>
-              <w:bidi/>
-              <w:jc w:val="right"/>
-            </w:pPr>
-            <w:r>
-              <w:rPr>
-                <w:rtl/>
-                <w:cs/>
-              </w:rPr>
-            </w:r>
-            <w:r>
-              <w:rPr>
-                <w:rtl/>
-                <w:cs/>
-              </w:rPr>
-              <w:t>OK — כולם מופיעים ברשימה</w:t>
-            </w:r>
-          </w:p>
-        </w:tc>
-      </w:tr>
-      <w:tr>
-        <w:tc>
-          <w:tcPr>
-            <w:tcW w:type="dxa" w:w="4802"/>
-          </w:tcPr>
-          <w:p>
-            <w:pPr>
-              <w:bidi/>
-              <w:jc w:val="right"/>
-            </w:pPr>
-            <w:r>
-              <w:rPr>
-                <w:rtl/>
-                <w:cs/>
-              </w:rPr>
-            </w:r>
-            <w:r>
-              <w:rPr>
-                <w:rtl/>
-                <w:cs/>
-              </w:rPr>
-              <w:t>יצירת חשבונית + 2 שורות</w:t>
-            </w:r>
-          </w:p>
-        </w:tc>
-        <w:tc>
-          <w:tcPr>
-            <w:tcW w:type="dxa" w:w="4802"/>
-          </w:tcPr>
-          <w:p>
-            <w:pPr>
-              <w:bidi/>
-              <w:jc w:val="right"/>
-            </w:pPr>
-            <w:r>
-              <w:rPr>
-                <w:rtl/>
-                <w:cs/>
-              </w:rPr>
-            </w:r>
-            <w:r>
-              <w:rPr>
-                <w:rtl/>
-                <w:cs/>
-              </w:rPr>
-              <w:t>OK — חישוב מע״מ אוטומטי</w:t>
-            </w:r>
-          </w:p>
-        </w:tc>
-      </w:tr>
-      <w:tr>
-        <w:tc>
-          <w:tcPr>
-            <w:tcW w:type="dxa" w:w="4802"/>
-          </w:tcPr>
-          <w:p>
-            <w:pPr>
-              <w:bidi/>
-              <w:jc w:val="right"/>
-            </w:pPr>
-            <w:r>
-              <w:rPr>
-                <w:rtl/>
-                <w:cs/>
-              </w:rPr>
-            </w:r>
-            <w:r>
-              <w:rPr>
-                <w:rtl/>
-                <w:cs/>
-              </w:rPr>
-              <w:t>הורדת PDF של חשבונית</w:t>
-            </w:r>
-          </w:p>
-        </w:tc>
-        <w:tc>
-          <w:tcPr>
-            <w:tcW w:type="dxa" w:w="4802"/>
-          </w:tcPr>
-          <w:p>
-            <w:pPr>
-              <w:bidi/>
-              <w:jc w:val="right"/>
-            </w:pPr>
-            <w:r>
-              <w:rPr>
-                <w:rtl/>
-                <w:cs/>
-              </w:rPr>
-            </w:r>
-            <w:r>
-              <w:rPr>
-                <w:rtl/>
-                <w:cs/>
-              </w:rPr>
-              <w:t>OK — נפתח ב-Acrobat</w:t>
-            </w:r>
-          </w:p>
-        </w:tc>
-      </w:tr>
-      <w:tr>
-        <w:tc>
-          <w:tcPr>
-            <w:tcW w:type="dxa" w:w="4802"/>
-          </w:tcPr>
-          <w:p>
-            <w:pPr>
-              <w:bidi/>
-              <w:jc w:val="right"/>
-            </w:pPr>
-            <w:r>
-              <w:rPr>
-                <w:rtl/>
-                <w:cs/>
-              </w:rPr>
-            </w:r>
-            <w:r>
-              <w:rPr>
-                <w:rtl/>
-                <w:cs/>
-              </w:rPr>
-              <w:t>דיווח הוצאה + Auto-VAT</w:t>
-            </w:r>
-          </w:p>
-        </w:tc>
-        <w:tc>
-          <w:tcPr>
-            <w:tcW w:type="dxa" w:w="4802"/>
-          </w:tcPr>
-          <w:p>
-            <w:pPr>
-              <w:bidi/>
-              <w:jc w:val="right"/>
-            </w:pPr>
-            <w:r>
-              <w:rPr>
-                <w:rtl/>
-                <w:cs/>
-              </w:rPr>
-            </w:r>
-            <w:r>
-              <w:rPr>
-                <w:rtl/>
-                <w:cs/>
-              </w:rPr>
-              <w:t>OK — מע״מ ממולא 17/117</w:t>
-            </w:r>
-          </w:p>
-        </w:tc>
-      </w:tr>
-      <w:tr>
-        <w:tc>
-          <w:tcPr>
-            <w:tcW w:type="dxa" w:w="4802"/>
-          </w:tcPr>
-          <w:p>
-            <w:pPr>
-              <w:bidi/>
-              <w:jc w:val="right"/>
-            </w:pPr>
-            <w:r>
-              <w:rPr>
-                <w:rtl/>
-                <w:cs/>
-              </w:rPr>
-            </w:r>
-            <w:r>
-              <w:rPr>
-                <w:rtl/>
-                <w:cs/>
-              </w:rPr>
-              <w:t>העלאת קבלה (PDF, 1.2 MB)</w:t>
-            </w:r>
-          </w:p>
-        </w:tc>
-        <w:tc>
-          <w:tcPr>
-            <w:tcW w:type="dxa" w:w="4802"/>
-          </w:tcPr>
-          <w:p>
-            <w:pPr>
-              <w:bidi/>
-              <w:jc w:val="right"/>
-            </w:pPr>
-            <w:r>
-              <w:rPr>
-                <w:rtl/>
-                <w:cs/>
-              </w:rPr>
-            </w:r>
-            <w:r>
-              <w:rPr>
-                <w:rtl/>
-                <w:cs/>
-              </w:rPr>
-              <w:t>OK — נשמרת ב-`/Receipts`</w:t>
-            </w:r>
-          </w:p>
-        </w:tc>
-      </w:tr>
-      <w:tr>
-        <w:tc>
-          <w:tcPr>
-            <w:tcW w:type="dxa" w:w="4802"/>
-          </w:tcPr>
-          <w:p>
-            <w:pPr>
-              <w:bidi/>
-              <w:jc w:val="right"/>
-            </w:pPr>
-            <w:r>
-              <w:rPr>
-                <w:rtl/>
-                <w:cs/>
-              </w:rPr>
-            </w:r>
-            <w:r>
-              <w:rPr>
-                <w:rtl/>
-                <w:cs/>
-              </w:rPr>
-              <w:t>Forgot password → Owner notif → Reset → reset1234 → Settings</w:t>
-            </w:r>
-          </w:p>
-        </w:tc>
-        <w:tc>
-          <w:tcPr>
-            <w:tcW w:type="dxa" w:w="4802"/>
-          </w:tcPr>
-          <w:p>
-            <w:pPr>
-              <w:bidi/>
-              <w:jc w:val="right"/>
-            </w:pPr>
-            <w:r>
-              <w:rPr>
-                <w:rtl/>
-                <w:cs/>
-              </w:rPr>
-            </w:r>
-            <w:r>
-              <w:rPr>
-                <w:rtl/>
-                <w:cs/>
-              </w:rPr>
-              <w:t>OK — תהליך שלם</w:t>
-            </w:r>
-          </w:p>
-        </w:tc>
-      </w:tr>
-      <w:tr>
-        <w:tc>
-          <w:tcPr>
-            <w:tcW w:type="dxa" w:w="4802"/>
-          </w:tcPr>
-          <w:p>
-            <w:pPr>
-              <w:bidi/>
-              <w:jc w:val="right"/>
-            </w:pPr>
-            <w:r>
-              <w:rPr>
-                <w:rtl/>
-                <w:cs/>
-              </w:rPr>
-            </w:r>
-            <w:r>
-              <w:rPr>
-                <w:rtl/>
-                <w:cs/>
-              </w:rPr>
-              <w:t>Mark VAT paid</w:t>
-            </w:r>
-          </w:p>
-        </w:tc>
-        <w:tc>
-          <w:tcPr>
-            <w:tcW w:type="dxa" w:w="4802"/>
-          </w:tcPr>
-          <w:p>
-            <w:pPr>
-              <w:bidi/>
-              <w:jc w:val="right"/>
-            </w:pPr>
-            <w:r>
-              <w:rPr>
-                <w:rtl/>
-                <w:cs/>
-              </w:rPr>
-            </w:r>
-            <w:r>
-              <w:rPr>
-                <w:rtl/>
-                <w:cs/>
-              </w:rPr>
-              <w:t>OK — הוצאה נרשמת לרשות המסים</w:t>
-            </w:r>
-          </w:p>
-        </w:tc>
-      </w:tr>
-      <w:tr>
-        <w:tc>
-          <w:tcPr>
-            <w:tcW w:type="dxa" w:w="4802"/>
-          </w:tcPr>
-          <w:p>
-            <w:pPr>
-              <w:bidi/>
-              <w:jc w:val="right"/>
-            </w:pPr>
-            <w:r>
-              <w:rPr>
-                <w:rtl/>
-                <w:cs/>
-              </w:rPr>
-            </w:r>
-            <w:r>
-              <w:rPr>
-                <w:rtl/>
-                <w:cs/>
-              </w:rPr>
-              <w:t>ייצוא CSV — Customers, Expenses, Reports</w:t>
-            </w:r>
-          </w:p>
-        </w:tc>
-        <w:tc>
-          <w:tcPr>
-            <w:tcW w:type="dxa" w:w="4802"/>
-          </w:tcPr>
-          <w:p>
-            <w:pPr>
-              <w:bidi/>
-              <w:jc w:val="right"/>
-            </w:pPr>
-            <w:r>
-              <w:rPr>
-                <w:rtl/>
-                <w:cs/>
-              </w:rPr>
-            </w:r>
-            <w:r>
-              <w:rPr>
-                <w:rtl/>
-                <w:cs/>
-              </w:rPr>
-              <w:t>OK</w:t>
-            </w:r>
-          </w:p>
-        </w:tc>
-      </w:tr>
-      <w:tr>
-        <w:tc>
-          <w:tcPr>
-            <w:tcW w:type="dxa" w:w="4802"/>
-          </w:tcPr>
-          <w:p>
-            <w:pPr>
-              <w:bidi/>
-              <w:jc w:val="right"/>
-            </w:pPr>
-            <w:r>
-              <w:rPr>
-                <w:rtl/>
-                <w:cs/>
-              </w:rPr>
-            </w:r>
-            <w:r>
-              <w:rPr>
-                <w:rtl/>
-                <w:cs/>
-              </w:rPr>
-              <w:t>Polling badge מתעדכן</w:t>
-            </w:r>
-          </w:p>
-        </w:tc>
-        <w:tc>
-          <w:tcPr>
-            <w:tcW w:type="dxa" w:w="4802"/>
-          </w:tcPr>
-          <w:p>
-            <w:pPr>
-              <w:bidi/>
-              <w:jc w:val="right"/>
-            </w:pPr>
-            <w:r>
-              <w:rPr>
-                <w:rtl/>
-                <w:cs/>
-              </w:rPr>
-            </w:r>
-            <w:r>
-              <w:rPr>
-                <w:rtl/>
-                <w:cs/>
-              </w:rPr>
-              <w:t>OK — תג אדום עם מספר התראות</w:t>
-            </w:r>
-          </w:p>
-        </w:tc>
-      </w:tr>
-    </w:tbl>
+      </w:pPr>
+      <w:r>
+        <w:rPr>
+          <w:rtl/>
+          <w:cs/>
+        </w:rPr>
+        <w:t>WCF Service1 במרכז — BasicHttpBinding על פורט 8733, חושף ~50 OperationContract.</w:t>
+      </w:r>
+    </w:p>
+    <w:p>
+      <w:pPr>
+        <w:pStyle w:val="ListBullet"/>
+        <w:bidi/>
+        <w:jc w:val="right"/>
+      </w:pPr>
+      <w:r>
+        <w:rPr>
+          <w:rtl/>
+          <w:cs/>
+        </w:rPr>
+        <w:t>BusinessLogic — PdfSharp + CurrencyConverter + VatCalculator + InvoiceNumberer.</w:t>
+      </w:r>
+    </w:p>
+    <w:p>
+      <w:pPr>
+        <w:pStyle w:val="ListBullet"/>
+        <w:bidi/>
+        <w:jc w:val="right"/>
+      </w:pPr>
+      <w:r>
+        <w:rPr>
+          <w:rtl/>
+          <w:cs/>
+        </w:rPr>
+        <w:t>ViewDB — שכבת BaseDB גנרית + 10 DBים ספציפיים לטבלה.</w:t>
+      </w:r>
+    </w:p>
+    <w:p>
+      <w:pPr>
+        <w:pStyle w:val="ListBullet"/>
+        <w:bidi/>
+        <w:jc w:val="right"/>
+      </w:pPr>
+      <w:r>
+        <w:rPr>
+          <w:rtl/>
+          <w:cs/>
+        </w:rPr>
+        <w:t>ProjectAssignmentDB — שכבת multi-assign עם EnsureSchema אוטומטי.</w:t>
+      </w:r>
+    </w:p>
+    <w:p>
+      <w:pPr>
+        <w:pStyle w:val="ListBullet"/>
+        <w:bidi/>
+        <w:jc w:val="right"/>
+      </w:pPr>
+      <w:r>
+        <w:rPr>
+          <w:rtl/>
+          <w:cs/>
+        </w:rPr>
+        <w:t>BManaged.accdb בתחתית — 13 טבלאות, נזרע עם admin/dana/acme + ILS↔USD.</w:t>
+      </w:r>
+    </w:p>
+    <w:p>
+      <w:pPr>
+        <w:bidi/>
+        <w:jc w:val="right"/>
+      </w:pPr>
+      <w:r>
+        <w:rPr>
+          <w:sz w:val="22"/>
+          <w:rtl/>
+          <w:cs/>
+        </w:rPr>
+        <w:t>חצים מסומנים: WCF SOAP בין הלקוחות לשרת, OleDb (parameterized) בין ה-DB לקובץ ה-Access.</w:t>
+      </w:r>
+    </w:p>
+    <w:p>
+      <w:pPr>
+        <w:jc w:val="center"/>
+      </w:pPr>
+      <w:r>
+        <w:drawing>
+          <wp:inline xmlns:a="http://schemas.openxmlformats.org/drawingml/2006/main" xmlns:pic="http://schemas.openxmlformats.org/drawingml/2006/picture">
+            <wp:extent cx="5943600" cy="3496235"/>
+            <wp:docPr id="1" name="Picture 1"/>
+            <wp:cNvGraphicFramePr>
+              <a:graphicFrameLocks noChangeAspect="1"/>
+            </wp:cNvGraphicFramePr>
+            <a:graphic>
+              <a:graphicData uri="http://schemas.openxmlformats.org/drawingml/2006/picture">
+                <pic:pic>
+                  <pic:nvPicPr>
+                    <pic:cNvPr id="0" name="arch-flow.png"/>
+                    <pic:cNvPicPr/>
+                  </pic:nvPicPr>
+                  <pic:blipFill>
+                    <a:blip r:embed="rId9"/>
+                    <a:stretch>
+                      <a:fillRect/>
+                    </a:stretch>
+                  </pic:blipFill>
+                  <pic:spPr>
+                    <a:xfrm>
+                      <a:off x="0" y="0"/>
+                      <a:ext cx="5943600" cy="3496235"/>
+                    </a:xfrm>
+                    <a:prstGeom prst="rect"/>
+                  </pic:spPr>
+                </pic:pic>
+              </a:graphicData>
+            </a:graphic>
+          </wp:inline>
+        </w:drawing>
+      </w:r>
+    </w:p>
+    <w:p>
+      <w:pPr>
+        <w:pStyle w:val="Heading2"/>
+        <w:bidi/>
+        <w:jc w:val="right"/>
+      </w:pPr>
+      <w:r>
+        <w:rPr>
+          <w:rtl/>
+          <w:cs/>
+        </w:rPr>
+        <w:t>21.2 זרימה ב-WPF — `wpf-flow.png`</w:t>
+      </w:r>
+    </w:p>
+    <w:p>
+      <w:pPr>
+        <w:bidi/>
+        <w:jc w:val="right"/>
+      </w:pPr>
+      <w:r>
+        <w:rPr>
+          <w:sz w:val="22"/>
+          <w:rtl/>
+          <w:cs/>
+        </w:rPr>
+        <w:t>מסך LogIn מנתב לאחת משלוש דשבורדים (OwnerHome, EmployeeHome, ClientHome) לפי שדה Role של המשתמש. כל דשבורד הוא רכזת לכ-8 דפי משנה. מצוין במפורש:</w:t>
+      </w:r>
+    </w:p>
+    <w:p>
+      <w:pPr>
+        <w:pStyle w:val="ListBullet"/>
+        <w:bidi/>
+        <w:jc w:val="right"/>
+      </w:pPr>
+      <w:r>
+        <w:rPr>
+          <w:rtl/>
+          <w:cs/>
+        </w:rPr>
+        <w:t>OwnerHome מנתב ל: Customers, Projects, Invoices, Expenses, Reports, ManageUsers, Settings, Notifications. DispatcherTimer רץ כל 15 שניות לרענון סטטיסטיקות + תג התראות.</w:t>
+      </w:r>
+    </w:p>
+    <w:p>
+      <w:pPr>
+        <w:pStyle w:val="ListBullet"/>
+        <w:bidi/>
+        <w:jc w:val="right"/>
+      </w:pPr>
+      <w:r>
+        <w:rPr>
+          <w:rtl/>
+          <w:cs/>
+        </w:rPr>
+        <w:t>EmployeeHome מנתב ל: EmployeeProjects (פאנל פירוט), Expenses (משלו בלבד), Settings, Notifications.</w:t>
+      </w:r>
+    </w:p>
+    <w:p>
+      <w:pPr>
+        <w:pStyle w:val="ListBullet"/>
+        <w:bidi/>
+        <w:jc w:val="right"/>
+      </w:pPr>
+      <w:r>
+        <w:rPr>
+          <w:rtl/>
+          <w:cs/>
+        </w:rPr>
+        <w:t>ClientHome מנתב ל: Settings, Logout. Polling כל 30 שניות.</w:t>
+      </w:r>
+    </w:p>
+    <w:p>
+      <w:pPr>
+        <w:pStyle w:val="ListBullet"/>
+        <w:bidi/>
+        <w:jc w:val="right"/>
+      </w:pPr>
+      <w:r>
+        <w:rPr>
+          <w:rtl/>
+          <w:cs/>
+        </w:rPr>
+        <w:t>SignUp ו-ForgotPassword נגישים מ-LogIn ישירות (ללא צורך באימות).</w:t>
+      </w:r>
+    </w:p>
+    <w:p>
+      <w:pPr>
+        <w:pStyle w:val="ListBullet"/>
+        <w:bidi/>
+        <w:jc w:val="right"/>
+      </w:pPr>
+      <w:r>
+        <w:rPr>
+          <w:rtl/>
+          <w:cs/>
+        </w:rPr>
+        <w:t>קישור צולב מיוחד: לחיצה כפולה על התראה מסוג ResetRequest בעמוד Notifications מנתבת ישירות ל-ManageUsers (חוסכת לבעלים אינטרקציה ידנית).</w:t>
+      </w:r>
+    </w:p>
+    <w:p>
+      <w:pPr>
+        <w:jc w:val="center"/>
+      </w:pPr>
+      <w:r>
+        <w:drawing>
+          <wp:inline xmlns:a="http://schemas.openxmlformats.org/drawingml/2006/main" xmlns:pic="http://schemas.openxmlformats.org/drawingml/2006/picture">
+            <wp:extent cx="5943600" cy="3496235"/>
+            <wp:docPr id="2" name="Picture 2"/>
+            <wp:cNvGraphicFramePr>
+              <a:graphicFrameLocks noChangeAspect="1"/>
+            </wp:cNvGraphicFramePr>
+            <a:graphic>
+              <a:graphicData uri="http://schemas.openxmlformats.org/drawingml/2006/picture">
+                <pic:pic>
+                  <pic:nvPicPr>
+                    <pic:cNvPr id="0" name="wpf-flow.png"/>
+                    <pic:cNvPicPr/>
+                  </pic:nvPicPr>
+                  <pic:blipFill>
+                    <a:blip r:embed="rId10"/>
+                    <a:stretch>
+                      <a:fillRect/>
+                    </a:stretch>
+                  </pic:blipFill>
+                  <pic:spPr>
+                    <a:xfrm>
+                      <a:off x="0" y="0"/>
+                      <a:ext cx="5943600" cy="3496235"/>
+                    </a:xfrm>
+                    <a:prstGeom prst="rect"/>
+                  </pic:spPr>
+                </pic:pic>
+              </a:graphicData>
+            </a:graphic>
+          </wp:inline>
+        </w:drawing>
+      </w:r>
+    </w:p>
+    <w:p>
+      <w:pPr>
+        <w:pStyle w:val="Heading2"/>
+        <w:bidi/>
+        <w:jc w:val="right"/>
+      </w:pPr>
+      <w:r>
+        <w:rPr>
+          <w:rtl/>
+          <w:cs/>
+        </w:rPr>
+        <w:t>21.3 זרימה ב-Web — `web-flow.png`</w:t>
+      </w:r>
+    </w:p>
+    <w:p>
+      <w:pPr>
+        <w:bidi/>
+        <w:jc w:val="right"/>
+      </w:pPr>
+      <w:r>
+        <w:rPr>
+          <w:sz w:val="22"/>
+          <w:rtl/>
+          <w:cs/>
+        </w:rPr>
+        <w:t>המבנה דומה ל-WPF אבל ללא Frame: ה-Razor page כל פעם הוא הדף השלם, וה-Session שומרת את ה-Role. כל דף בודק Session["Role"] ב-OnGet ומעביר ל-Login אם לא תואם.</w:t>
+      </w:r>
+    </w:p>
+    <w:p>
+      <w:pPr>
+        <w:pStyle w:val="ListBullet"/>
+        <w:bidi/>
+        <w:jc w:val="right"/>
+      </w:pPr>
+      <w:r>
+        <w:rPr>
+          <w:rtl/>
+          <w:cs/>
+        </w:rPr>
+        <w:t>Owner spokes עם 6 דפים: Customers (modal + CSV), Projects (multi-assign modal), Invoices (PDF), Expenses (Auto-VAT + העלאת קבלה + CSV), Reports (VAT pay button + Chart.js), Users.</w:t>
+      </w:r>
+    </w:p>
+    <w:p>
+      <w:pPr>
+        <w:pStyle w:val="ListBullet"/>
+        <w:bidi/>
+        <w:jc w:val="right"/>
+      </w:pPr>
+      <w:r>
+        <w:rPr>
+          <w:rtl/>
+          <w:cs/>
+        </w:rPr>
+        <w:t>Employee spokes: Projects + Expenses.</w:t>
+      </w:r>
+    </w:p>
+    <w:p>
+      <w:pPr>
+        <w:pStyle w:val="ListBullet"/>
+        <w:bidi/>
+        <w:jc w:val="right"/>
+      </w:pPr>
+      <w:r>
+        <w:rPr>
+          <w:rtl/>
+          <w:cs/>
+        </w:rPr>
+        <w:t>Client spokes: InvoiceView.</w:t>
+      </w:r>
+    </w:p>
+    <w:p>
+      <w:pPr>
+        <w:pStyle w:val="ListBullet"/>
+        <w:bidi/>
+        <w:jc w:val="right"/>
+      </w:pPr>
+      <w:r>
+        <w:rPr>
+          <w:rtl/>
+          <w:cs/>
+        </w:rPr>
+        <w:t>כללי: /Notifications עם תג חי שמתעדכן כל 30 שניות, /Lang?target=he למתג שפה.</w:t>
+      </w:r>
+    </w:p>
+    <w:p>
+      <w:pPr>
+        <w:jc w:val="center"/>
+      </w:pPr>
+      <w:r>
+        <w:drawing>
+          <wp:inline xmlns:a="http://schemas.openxmlformats.org/drawingml/2006/main" xmlns:pic="http://schemas.openxmlformats.org/drawingml/2006/picture">
+            <wp:extent cx="5943600" cy="3496235"/>
+            <wp:docPr id="3" name="Picture 3"/>
+            <wp:cNvGraphicFramePr>
+              <a:graphicFrameLocks noChangeAspect="1"/>
+            </wp:cNvGraphicFramePr>
+            <a:graphic>
+              <a:graphicData uri="http://schemas.openxmlformats.org/drawingml/2006/picture">
+                <pic:pic>
+                  <pic:nvPicPr>
+                    <pic:cNvPr id="0" name="web-flow.png"/>
+                    <pic:cNvPicPr/>
+                  </pic:nvPicPr>
+                  <pic:blipFill>
+                    <a:blip r:embed="rId11"/>
+                    <a:stretch>
+                      <a:fillRect/>
+                    </a:stretch>
+                  </pic:blipFill>
+                  <pic:spPr>
+                    <a:xfrm>
+                      <a:off x="0" y="0"/>
+                      <a:ext cx="5943600" cy="3496235"/>
+                    </a:xfrm>
+                    <a:prstGeom prst="rect"/>
+                  </pic:spPr>
+                </pic:pic>
+              </a:graphicData>
+            </a:graphic>
+          </wp:inline>
+        </w:drawing>
+      </w:r>
+    </w:p>
     <w:p>
       <w:pPr>
         <w:pStyle w:val="Heading1"/>
@@ -11783,7 +11222,21 @@
           <w:rtl/>
           <w:cs/>
         </w:rPr>
-        <w:t>_smoke.py, _smoke_roles.py — בדיקות smoke</w:t>
+        <w:t>_make_flows.py — מחדש את שלוש תמונות הזרימה (arch / wpf / web)</w:t>
+      </w:r>
+    </w:p>
+    <w:p>
+      <w:pPr>
+        <w:pStyle w:val="ListBullet"/>
+        <w:bidi/>
+        <w:jc w:val="right"/>
+      </w:pPr>
+      <w:r>
+        <w:rPr>
+          <w:rtl/>
+          <w:cs/>
+        </w:rPr>
+        <w:t>_md_to_docx_v6.py — בונה את הספר ל-DOCX עם RTL מלא</w:t>
       </w:r>
     </w:p>
     <w:p>

</xml_diff>